<commit_message>
Corrige dados conforme o PARO 2026
- UE 1250057 (EM CPE), UPG 0025 obrigatória no empenho (art. 52)
- processo SIAD com o código de Compras 1251655
- elementos-itens com a descrição do Anexo X; caso 5101 em 39.18
  (marcado) e caso 5102 em 30.16 (material de informática)

Co-Authored-By: Claude Opus 5.5 <noreply@anthropic.com>
Claude-Session: https://claude.ai/code/session_017WkAoUekkvr4DuFbwx2atn
</commit_message>
<xml_diff>
--- a/treinamento-siafi/Especificacoes_3_Casos_Impressao.docx
+++ b/treinamento-siafi/Especificacoes_3_Casos_Impressao.docx
@@ -184,7 +184,7 @@
                 <w:sz w:val="18"/>
                 <w:szCs w:val="18"/>
               </w:rPr>
-              <w:t xml:space="preserve">1250057 615 2026</w:t>
+              <w:t xml:space="preserve">1251655 615 2026</w:t>
             </w:r>
           </w:p>
         </w:tc>
@@ -448,7 +448,7 @@
                 <w:sz w:val="18"/>
                 <w:szCs w:val="18"/>
               </w:rPr>
-              <w:t xml:space="preserve">Manutenção preventiva da frota, sem fornecimento de peças</w:t>
+              <w:t xml:space="preserve">Manutenção preventiva da frota (mão de obra), sem fornecimento de peças, óleos e lubrificantes</w:t>
             </w:r>
           </w:p>
         </w:tc>
@@ -1161,7 +1161,7 @@
                 <w:sz w:val="18"/>
                 <w:szCs w:val="18"/>
               </w:rPr>
-              <w:t xml:space="preserve">Fonte / Proc. / IPE</w:t>
+              <w:t xml:space="preserve">Fonte / Proc. / IPE / UPG</w:t>
             </w:r>
           </w:p>
         </w:tc>
@@ -1193,7 +1193,7 @@
                 <w:sz w:val="18"/>
                 <w:szCs w:val="18"/>
               </w:rPr>
-              <w:t xml:space="preserve">6020 / 1 / 0</w:t>
+              <w:t xml:space="preserve">6020 / 1 / 0 / 0025</w:t>
             </w:r>
           </w:p>
         </w:tc>
@@ -1325,7 +1325,7 @@
                 <w:sz w:val="18"/>
                 <w:szCs w:val="18"/>
               </w:rPr>
-              <w:t xml:space="preserve">16</w:t>
+              <w:t xml:space="preserve">18</w:t>
             </w:r>
           </w:p>
         </w:tc>
@@ -1392,7 +1392,7 @@
                 <w:sz w:val="18"/>
                 <w:szCs w:val="18"/>
               </w:rPr>
-              <w:t xml:space="preserve">39.16, manutenção e conservação de veículos</w:t>
+              <w:t xml:space="preserve">39.18, reparos de veículos</w:t>
             </w:r>
           </w:p>
         </w:tc>
@@ -1457,7 +1457,7 @@
                 <w:sz w:val="18"/>
                 <w:szCs w:val="18"/>
               </w:rPr>
-              <w:t xml:space="preserve">NÃO</w:t>
+              <w:t xml:space="preserve">SIM (Anexo XIII)</w:t>
             </w:r>
           </w:p>
         </w:tc>
@@ -1524,7 +1524,7 @@
                 <w:sz w:val="18"/>
                 <w:szCs w:val="18"/>
               </w:rPr>
-              <w:t xml:space="preserve">Global – GMIFP</w:t>
+              <w:t xml:space="preserve">Elemento/Item</w:t>
             </w:r>
           </w:p>
         </w:tc>
@@ -2068,7 +2068,7 @@
                 <w:sz w:val="18"/>
                 <w:szCs w:val="18"/>
               </w:rPr>
-              <w:t xml:space="preserve">Revisão preventiva de viatura leve (troca de óleo, filtros e alinhamento)</w:t>
+              <w:t xml:space="preserve">Revisão preventiva de viatura leve (mão de obra: inspeção, regulagem e alinhamento)</w:t>
             </w:r>
           </w:p>
         </w:tc>
@@ -2262,7 +2262,7 @@
                 <w:sz w:val="18"/>
                 <w:szCs w:val="18"/>
               </w:rPr>
-              <w:t xml:space="preserve">Revisão preventiva de motocicleta</w:t>
+              <w:t xml:space="preserve">Revisão preventiva de motocicleta (mão de obra)</w:t>
             </w:r>
           </w:p>
         </w:tc>
@@ -2998,7 +2998,7 @@
                 <w:sz w:val="18"/>
                 <w:szCs w:val="18"/>
               </w:rPr>
-              <w:t xml:space="preserve">1250057 511 2026</w:t>
+              <w:t xml:space="preserve">1251655 511 2026</w:t>
             </w:r>
           </w:p>
         </w:tc>
@@ -3792,7 +3792,7 @@
                 <w:sz w:val="18"/>
                 <w:szCs w:val="18"/>
               </w:rPr>
-              <w:t xml:space="preserve">1250057 620 2026</w:t>
+              <w:t xml:space="preserve">1251655 620 2026</w:t>
             </w:r>
           </w:p>
         </w:tc>
@@ -4769,7 +4769,7 @@
                 <w:sz w:val="18"/>
                 <w:szCs w:val="18"/>
               </w:rPr>
-              <w:t xml:space="preserve">Fonte / Proc. / IPE</w:t>
+              <w:t xml:space="preserve">Fonte / Proc. / IPE / UPG</w:t>
             </w:r>
           </w:p>
         </w:tc>
@@ -4801,7 +4801,7 @@
                 <w:sz w:val="18"/>
                 <w:szCs w:val="18"/>
               </w:rPr>
-              <w:t xml:space="preserve">6020 / 1 / 0</w:t>
+              <w:t xml:space="preserve">6020 / 1 / 0 / 0025</w:t>
             </w:r>
           </w:p>
         </w:tc>
@@ -4933,7 +4933,7 @@
                 <w:sz w:val="18"/>
                 <w:szCs w:val="18"/>
               </w:rPr>
-              <w:t xml:space="preserve">17</w:t>
+              <w:t xml:space="preserve">16</w:t>
             </w:r>
           </w:p>
         </w:tc>
@@ -5000,7 +5000,7 @@
                 <w:sz w:val="18"/>
                 <w:szCs w:val="18"/>
               </w:rPr>
-              <w:t xml:space="preserve">30.17, material de processamento de dados</w:t>
+              <w:t xml:space="preserve">30.16, material de informática</w:t>
             </w:r>
           </w:p>
         </w:tc>
@@ -6606,7 +6606,7 @@
                 <w:sz w:val="18"/>
                 <w:szCs w:val="18"/>
               </w:rPr>
-              <w:t xml:space="preserve">1250057 512 2026</w:t>
+              <w:t xml:space="preserve">1251655 512 2026</w:t>
             </w:r>
           </w:p>
         </w:tc>
@@ -7332,7 +7332,7 @@
                 <w:sz w:val="18"/>
                 <w:szCs w:val="18"/>
               </w:rPr>
-              <w:t xml:space="preserve">1250057 630 2026</w:t>
+              <w:t xml:space="preserve">1251655 630 2026</w:t>
             </w:r>
           </w:p>
         </w:tc>
@@ -8309,7 +8309,7 @@
                 <w:sz w:val="18"/>
                 <w:szCs w:val="18"/>
               </w:rPr>
-              <w:t xml:space="preserve">Fonte / Proc. / IPE</w:t>
+              <w:t xml:space="preserve">Fonte / Proc. / IPE / UPG</w:t>
             </w:r>
           </w:p>
         </w:tc>
@@ -8341,7 +8341,7 @@
                 <w:sz w:val="18"/>
                 <w:szCs w:val="18"/>
               </w:rPr>
-              <w:t xml:space="preserve">6020 / 1 / 0</w:t>
+              <w:t xml:space="preserve">6020 / 1 / 0 / 0025</w:t>
             </w:r>
           </w:p>
         </w:tc>
@@ -8540,7 +8540,7 @@
                 <w:sz w:val="18"/>
                 <w:szCs w:val="18"/>
               </w:rPr>
-              <w:t xml:space="preserve">37.01, locação de mão de obra: limpeza e conservação</w:t>
+              <w:t xml:space="preserve">37.01, locação de serviços de conservação e limpeza</w:t>
             </w:r>
           </w:p>
         </w:tc>
@@ -9952,7 +9952,7 @@
                 <w:sz w:val="18"/>
                 <w:szCs w:val="18"/>
               </w:rPr>
-              <w:t xml:space="preserve">1250057 513 2026</w:t>
+              <w:t xml:space="preserve">1251655 513 2026</w:t>
             </w:r>
           </w:p>
         </w:tc>

</xml_diff>

<commit_message>
Simulador SIAFI v18: consulta 95, recolhimento por código de barras, UPG 25 e fonte 60/2/0; documentos atualizados
Co-Authored-By: Claude Opus 5.5 <noreply@anthropic.com>
Claude-Session: https://claude.ai/code/session_017WkAoUekkvr4DuFbwx2atn
</commit_message>
<xml_diff>
--- a/treinamento-siafi/Especificacoes_3_Casos_Impressao.docx
+++ b/treinamento-siafi/Especificacoes_3_Casos_Impressao.docx
@@ -1193,7 +1193,7 @@
                 <w:sz w:val="18"/>
                 <w:szCs w:val="18"/>
               </w:rPr>
-              <w:t xml:space="preserve">6020 / 1 / 0 / 0025</w:t>
+              <w:t xml:space="preserve">60 / 2 / 0 / 25</w:t>
             </w:r>
           </w:p>
         </w:tc>
@@ -1721,7 +1721,7 @@
                 <w:sz w:val="18"/>
                 <w:szCs w:val="18"/>
               </w:rPr>
-              <w:t xml:space="preserve">350057</w:t>
+              <w:t xml:space="preserve">1305820</w:t>
             </w:r>
           </w:p>
         </w:tc>
@@ -2966,7 +2966,7 @@
                 <w:sz w:val="18"/>
                 <w:szCs w:val="18"/>
               </w:rPr>
-              <w:t xml:space="preserve">Conformidade de liquidação</w:t>
+              <w:t xml:space="preserve">Guia ISS (cód. barras)</w:t>
             </w:r>
           </w:p>
         </w:tc>
@@ -2998,7 +2998,7 @@
                 <w:sz w:val="18"/>
                 <w:szCs w:val="18"/>
               </w:rPr>
-              <w:t xml:space="preserve">1251655 511 2026</w:t>
+              <w:t xml:space="preserve">81640000003 9 · 25000001187 5 · 15383000104 3 · 02026105101 3</w:t>
             </w:r>
           </w:p>
         </w:tc>
@@ -3031,7 +3031,7 @@
                 <w:sz w:val="18"/>
                 <w:szCs w:val="18"/>
               </w:rPr>
-              <w:t xml:space="preserve">Nr. Conf. SIAD</w:t>
+              <w:t xml:space="preserve">Competência</w:t>
             </w:r>
           </w:p>
         </w:tc>
@@ -3063,7 +3063,7 @@
                 <w:sz w:val="18"/>
                 <w:szCs w:val="18"/>
               </w:rPr>
-              <w:t xml:space="preserve">1</w:t>
+              <w:t xml:space="preserve">2026 / 10</w:t>
             </w:r>
           </w:p>
         </w:tc>
@@ -3098,7 +3098,7 @@
                 <w:sz w:val="18"/>
                 <w:szCs w:val="18"/>
               </w:rPr>
-              <w:t xml:space="preserve">Competência</w:t>
+              <w:t xml:space="preserve">Simples Nacional</w:t>
             </w:r>
           </w:p>
         </w:tc>
@@ -3130,7 +3130,7 @@
                 <w:sz w:val="18"/>
                 <w:szCs w:val="18"/>
               </w:rPr>
-              <w:t xml:space="preserve">2026 / 10</w:t>
+              <w:t xml:space="preserve">Não optante</w:t>
             </w:r>
           </w:p>
         </w:tc>
@@ -3163,81 +3163,13 @@
                 <w:sz w:val="18"/>
                 <w:szCs w:val="18"/>
               </w:rPr>
-              <w:t xml:space="preserve">Simples Nacional</w:t>
+              <w:t xml:space="preserve">Credor do ISS</w:t>
             </w:r>
           </w:p>
         </w:tc>
         <w:tc>
           <w:tcPr>
             <w:tcW w:type="dxa" w:w="2819"/>
-            <w:tcBorders>
-              <w:top w:val="single" w:color="9AA8B8" w:sz="4"/>
-              <w:left w:val="single" w:color="9AA8B8" w:sz="4"/>
-              <w:bottom w:val="single" w:color="9AA8B8" w:sz="4"/>
-              <w:right w:val="single" w:color="9AA8B8" w:sz="4"/>
-            </w:tcBorders>
-            <w:tcMar>
-              <w:top w:type="dxa" w:w="35"/>
-              <w:left w:type="dxa" w:w="90"/>
-              <w:bottom w:type="dxa" w:w="35"/>
-              <w:right w:type="dxa" w:w="90"/>
-            </w:tcMar>
-          </w:tcPr>
-          <w:p>
-            <w:pPr>
-              <w:jc w:val="left"/>
-            </w:pPr>
-            <w:r>
-              <w:rPr>
-                <w:rFonts w:ascii="Arial" w:cs="Arial" w:eastAsia="Arial" w:hAnsi="Arial"/>
-                <w:b w:val="false"/>
-                <w:bCs w:val="false"/>
-                <w:sz w:val="18"/>
-                <w:szCs w:val="18"/>
-              </w:rPr>
-              <w:t xml:space="preserve">Não optante</w:t>
-            </w:r>
-          </w:p>
-        </w:tc>
-      </w:tr>
-      <w:tr>
-        <w:tc>
-          <w:tcPr>
-            <w:tcW w:type="dxa" w:w="2000"/>
-            <w:tcBorders>
-              <w:top w:val="single" w:color="9AA8B8" w:sz="4"/>
-              <w:left w:val="single" w:color="9AA8B8" w:sz="4"/>
-              <w:bottom w:val="single" w:color="9AA8B8" w:sz="4"/>
-              <w:right w:val="single" w:color="9AA8B8" w:sz="4"/>
-            </w:tcBorders>
-            <w:shd w:fill="E8EDF3" w:color="auto" w:val="clear"/>
-            <w:tcMar>
-              <w:top w:type="dxa" w:w="35"/>
-              <w:left w:type="dxa" w:w="90"/>
-              <w:bottom w:type="dxa" w:w="35"/>
-              <w:right w:type="dxa" w:w="90"/>
-            </w:tcMar>
-          </w:tcPr>
-          <w:p>
-            <w:pPr>
-              <w:jc w:val="left"/>
-            </w:pPr>
-            <w:r>
-              <w:rPr>
-                <w:rFonts w:ascii="Arial" w:cs="Arial" w:eastAsia="Arial" w:hAnsi="Arial"/>
-                <w:b/>
-                <w:bCs/>
-                <w:sz w:val="18"/>
-                <w:szCs w:val="18"/>
-              </w:rPr>
-              <w:t xml:space="preserve">Credor do ISS</w:t>
-            </w:r>
-          </w:p>
-        </w:tc>
-        <w:tc>
-          <w:tcPr>
-            <w:tcW w:type="dxa" w:w="7638"/>
-            <w:gridSpan w:val="3"/>
             <w:tcBorders>
               <w:top w:val="single" w:color="9AA8B8" w:sz="4"/>
               <w:left w:val="single" w:color="9AA8B8" w:sz="4"/>
@@ -4801,7 +4733,7 @@
                 <w:sz w:val="18"/>
                 <w:szCs w:val="18"/>
               </w:rPr>
-              <w:t xml:space="preserve">6020 / 1 / 0 / 0025</w:t>
+              <w:t xml:space="preserve">60 / 2 / 0 / 25</w:t>
             </w:r>
           </w:p>
         </w:tc>
@@ -5329,7 +5261,7 @@
                 <w:sz w:val="18"/>
                 <w:szCs w:val="18"/>
               </w:rPr>
-              <w:t xml:space="preserve">350057</w:t>
+              <w:t xml:space="preserve">1305820</w:t>
             </w:r>
           </w:p>
         </w:tc>
@@ -6540,138 +6472,6 @@
                 <w:szCs w:val="18"/>
               </w:rPr>
               <w:t xml:space="preserve">Almoxarifado, 30/10/2026</w:t>
-            </w:r>
-          </w:p>
-        </w:tc>
-      </w:tr>
-      <w:tr>
-        <w:tc>
-          <w:tcPr>
-            <w:tcW w:type="dxa" w:w="2000"/>
-            <w:tcBorders>
-              <w:top w:val="single" w:color="9AA8B8" w:sz="4"/>
-              <w:left w:val="single" w:color="9AA8B8" w:sz="4"/>
-              <w:bottom w:val="single" w:color="9AA8B8" w:sz="4"/>
-              <w:right w:val="single" w:color="9AA8B8" w:sz="4"/>
-            </w:tcBorders>
-            <w:shd w:fill="E8EDF3" w:color="auto" w:val="clear"/>
-            <w:tcMar>
-              <w:top w:type="dxa" w:w="35"/>
-              <w:left w:type="dxa" w:w="90"/>
-              <w:bottom w:type="dxa" w:w="35"/>
-              <w:right w:type="dxa" w:w="90"/>
-            </w:tcMar>
-          </w:tcPr>
-          <w:p>
-            <w:pPr>
-              <w:jc w:val="left"/>
-            </w:pPr>
-            <w:r>
-              <w:rPr>
-                <w:rFonts w:ascii="Arial" w:cs="Arial" w:eastAsia="Arial" w:hAnsi="Arial"/>
-                <w:b/>
-                <w:bCs/>
-                <w:sz w:val="18"/>
-                <w:szCs w:val="18"/>
-              </w:rPr>
-              <w:t xml:space="preserve">Conformidade de liquidação</w:t>
-            </w:r>
-          </w:p>
-        </w:tc>
-        <w:tc>
-          <w:tcPr>
-            <w:tcW w:type="dxa" w:w="2819"/>
-            <w:tcBorders>
-              <w:top w:val="single" w:color="9AA8B8" w:sz="4"/>
-              <w:left w:val="single" w:color="9AA8B8" w:sz="4"/>
-              <w:bottom w:val="single" w:color="9AA8B8" w:sz="4"/>
-              <w:right w:val="single" w:color="9AA8B8" w:sz="4"/>
-            </w:tcBorders>
-            <w:tcMar>
-              <w:top w:type="dxa" w:w="35"/>
-              <w:left w:type="dxa" w:w="90"/>
-              <w:bottom w:type="dxa" w:w="35"/>
-              <w:right w:type="dxa" w:w="90"/>
-            </w:tcMar>
-          </w:tcPr>
-          <w:p>
-            <w:pPr>
-              <w:jc w:val="left"/>
-            </w:pPr>
-            <w:r>
-              <w:rPr>
-                <w:rFonts w:ascii="Arial" w:cs="Arial" w:eastAsia="Arial" w:hAnsi="Arial"/>
-                <w:b w:val="false"/>
-                <w:bCs w:val="false"/>
-                <w:sz w:val="18"/>
-                <w:szCs w:val="18"/>
-              </w:rPr>
-              <w:t xml:space="preserve">1251655 512 2026</w:t>
-            </w:r>
-          </w:p>
-        </w:tc>
-        <w:tc>
-          <w:tcPr>
-            <w:tcW w:type="dxa" w:w="2000"/>
-            <w:tcBorders>
-              <w:top w:val="single" w:color="9AA8B8" w:sz="4"/>
-              <w:left w:val="single" w:color="9AA8B8" w:sz="4"/>
-              <w:bottom w:val="single" w:color="9AA8B8" w:sz="4"/>
-              <w:right w:val="single" w:color="9AA8B8" w:sz="4"/>
-            </w:tcBorders>
-            <w:shd w:fill="E8EDF3" w:color="auto" w:val="clear"/>
-            <w:tcMar>
-              <w:top w:type="dxa" w:w="35"/>
-              <w:left w:type="dxa" w:w="90"/>
-              <w:bottom w:type="dxa" w:w="35"/>
-              <w:right w:type="dxa" w:w="90"/>
-            </w:tcMar>
-          </w:tcPr>
-          <w:p>
-            <w:pPr>
-              <w:jc w:val="left"/>
-            </w:pPr>
-            <w:r>
-              <w:rPr>
-                <w:rFonts w:ascii="Arial" w:cs="Arial" w:eastAsia="Arial" w:hAnsi="Arial"/>
-                <w:b/>
-                <w:bCs/>
-                <w:sz w:val="18"/>
-                <w:szCs w:val="18"/>
-              </w:rPr>
-              <w:t xml:space="preserve">Nr. Conf. SIAD</w:t>
-            </w:r>
-          </w:p>
-        </w:tc>
-        <w:tc>
-          <w:tcPr>
-            <w:tcW w:type="dxa" w:w="2819"/>
-            <w:tcBorders>
-              <w:top w:val="single" w:color="9AA8B8" w:sz="4"/>
-              <w:left w:val="single" w:color="9AA8B8" w:sz="4"/>
-              <w:bottom w:val="single" w:color="9AA8B8" w:sz="4"/>
-              <w:right w:val="single" w:color="9AA8B8" w:sz="4"/>
-            </w:tcBorders>
-            <w:tcMar>
-              <w:top w:type="dxa" w:w="35"/>
-              <w:left w:type="dxa" w:w="90"/>
-              <w:bottom w:type="dxa" w:w="35"/>
-              <w:right w:type="dxa" w:w="90"/>
-            </w:tcMar>
-          </w:tcPr>
-          <w:p>
-            <w:pPr>
-              <w:jc w:val="left"/>
-            </w:pPr>
-            <w:r>
-              <w:rPr>
-                <w:rFonts w:ascii="Arial" w:cs="Arial" w:eastAsia="Arial" w:hAnsi="Arial"/>
-                <w:b w:val="false"/>
-                <w:bCs w:val="false"/>
-                <w:sz w:val="18"/>
-                <w:szCs w:val="18"/>
-              </w:rPr>
-              <w:t xml:space="preserve">1</w:t>
             </w:r>
           </w:p>
         </w:tc>
@@ -8341,7 +8141,7 @@
                 <w:sz w:val="18"/>
                 <w:szCs w:val="18"/>
               </w:rPr>
-              <w:t xml:space="preserve">6020 / 1 / 0 / 0025</w:t>
+              <w:t xml:space="preserve">60 / 2 / 0 / 25</w:t>
             </w:r>
           </w:p>
         </w:tc>
@@ -8869,7 +8669,7 @@
                 <w:sz w:val="18"/>
                 <w:szCs w:val="18"/>
               </w:rPr>
-              <w:t xml:space="preserve">350057</w:t>
+              <w:t xml:space="preserve">1305820</w:t>
             </w:r>
           </w:p>
         </w:tc>
@@ -9920,7 +9720,7 @@
                 <w:sz w:val="18"/>
                 <w:szCs w:val="18"/>
               </w:rPr>
-              <w:t xml:space="preserve">Conformidade de liquidação</w:t>
+              <w:t xml:space="preserve">Guia INSS (cód. barras)</w:t>
             </w:r>
           </w:p>
         </w:tc>
@@ -9952,7 +9752,7 @@
                 <w:sz w:val="18"/>
                 <w:szCs w:val="18"/>
               </w:rPr>
-              <w:t xml:space="preserve">1251655 513 2026</w:t>
+              <w:t xml:space="preserve">85600000009 6 · 90000270299 2 · 79036000140 4 · 20261051030 9</w:t>
             </w:r>
           </w:p>
         </w:tc>
@@ -9985,7 +9785,7 @@
                 <w:sz w:val="18"/>
                 <w:szCs w:val="18"/>
               </w:rPr>
-              <w:t xml:space="preserve">Nr. Conf. SIAD</w:t>
+              <w:t xml:space="preserve">Guia ISS (cód. barras)</w:t>
             </w:r>
           </w:p>
         </w:tc>
@@ -10017,7 +9817,7 @@
                 <w:sz w:val="18"/>
                 <w:szCs w:val="18"/>
               </w:rPr>
-              <w:t xml:space="preserve">1</w:t>
+              <w:t xml:space="preserve">81650000002 0 · 70000001187 9 · 15383000104 3 · 02026105103 9</w:t>
             </w:r>
           </w:p>
         </w:tc>

</xml_diff>

<commit_message>
Simulador SIAFI v21: fonte 10/8/1 e conferência da dotação da especificação SIAD; documentos atualizados
Co-Authored-By: Claude Opus 5.5 <noreply@anthropic.com>
Claude-Session: https://claude.ai/code/session_017WkAoUekkvr4DuFbwx2atn
</commit_message>
<xml_diff>
--- a/treinamento-siafi/Especificacoes_3_Casos_Impressao.docx
+++ b/treinamento-siafi/Especificacoes_3_Casos_Impressao.docx
@@ -1128,7 +1128,7 @@
                 <w:sz w:val="18"/>
                 <w:szCs w:val="18"/>
               </w:rPr>
-              <w:t xml:space="preserve">06 181 701 2001 0001</w:t>
+              <w:t xml:space="preserve">06 181 701 2001 0001 (no SIAFI: 2001 0001)</w:t>
             </w:r>
           </w:p>
         </w:tc>
@@ -1193,7 +1193,7 @@
                 <w:sz w:val="18"/>
                 <w:szCs w:val="18"/>
               </w:rPr>
-              <w:t xml:space="preserve">60 / 2 / 0 / 25</w:t>
+              <w:t xml:space="preserve">10 / 8 / 1 / 25</w:t>
             </w:r>
           </w:p>
         </w:tc>
@@ -4668,7 +4668,7 @@
                 <w:sz w:val="18"/>
                 <w:szCs w:val="18"/>
               </w:rPr>
-              <w:t xml:space="preserve">06 181 701 2001 0001</w:t>
+              <w:t xml:space="preserve">06 181 701 2001 0001 (no SIAFI: 2001 0001)</w:t>
             </w:r>
           </w:p>
         </w:tc>
@@ -4733,7 +4733,7 @@
                 <w:sz w:val="18"/>
                 <w:szCs w:val="18"/>
               </w:rPr>
-              <w:t xml:space="preserve">60 / 2 / 0 / 25</w:t>
+              <w:t xml:space="preserve">10 / 8 / 1 / 25</w:t>
             </w:r>
           </w:p>
         </w:tc>
@@ -8076,7 +8076,7 @@
                 <w:sz w:val="18"/>
                 <w:szCs w:val="18"/>
               </w:rPr>
-              <w:t xml:space="preserve">06 181 701 2001 0001</w:t>
+              <w:t xml:space="preserve">06 181 701 2001 0001 (no SIAFI: 2001 0001)</w:t>
             </w:r>
           </w:p>
         </w:tc>
@@ -8141,7 +8141,7 @@
                 <w:sz w:val="18"/>
                 <w:szCs w:val="18"/>
               </w:rPr>
-              <w:t xml:space="preserve">60 / 2 / 0 / 25</w:t>
+              <w:t xml:space="preserve">10 / 8 / 1 / 25</w:t>
             </w:r>
           </w:p>
         </w:tc>

</xml_diff>